<commit_message>
Docs: correct false 10DLC-approved claim; SMS is toll-free only
There is no 10DLC/local number on the account and one was never approved.
SMS runs solely on toll-free 888-316-1695 (Toll-Free Verification approved
July 28, 2026). Corrected across WIP, EA, and Handoff.

Co-Authored-By: Claude Opus 4.8 <noreply@anthropic.com>
</commit_message>
<xml_diff>
--- a/Enyrgy_GHL_WIP-3.docx
+++ b/Enyrgy_GHL_WIP-3.docx
@@ -191,7 +191,7 @@
               <w:pStyle w:val="Compact"/>
             </w:pPr>
             <w:r>
-              <w:t xml:space="preserve">Fully Approved &amp; Verified - All 5 Items</w:t>
+              <w:t xml:space="preserve">Toll-free SMS APPROVED (888-316-1695, July 28) + Voice Integrity + SHAKEN/STIR. NO 10DLC/local number exists on the account.</w:t>
             </w:r>
           </w:p>
         </w:tc>
@@ -897,13 +897,12 @@
     <w:tbl>
       <w:tblPr>
         <w:tblStyle w:val="Table"/>
-        <w:tblW w:type="pct" w:w="5000"/>
-        <w:tblLayout w:type="fixed"/>
+        <w:tblW w:type="auto" w:w="0"/>
         <w:tblLook w:firstRow="1" w:lastRow="0" w:firstColumn="0" w:lastColumn="0" w:noHBand="0" w:noVBand="0" w:val="0020"/>
       </w:tblPr>
       <w:tblGrid>
-        <w:gridCol w:w="2262"/>
-        <w:gridCol w:w="3017"/>
+        <w:gridCol w:w="2640"/>
+        <w:gridCol w:w="2640"/>
         <w:gridCol w:w="2640"/>
       </w:tblGrid>
       <w:tr>
@@ -1022,7 +1021,42 @@
               <w:pStyle w:val="Compact"/>
             </w:pPr>
             <w:r>
-              <w:t xml:space="preserve">A2P 10DLC Registration</w:t>
+              <w:t xml:space="preserve">Voice Integrity</w:t>
+            </w:r>
+          </w:p>
+        </w:tc>
+        <w:tc>
+          <w:tcPr/>
+          <w:p>
+            <w:pPr>
+              <w:pStyle w:val="Compact"/>
+            </w:pPr>
+            <w:r>
+              <w:t xml:space="preserve">Passed &amp; Verified</w:t>
+            </w:r>
+          </w:p>
+        </w:tc>
+        <w:tc>
+          <w:tcPr/>
+          <w:p>
+            <w:pPr>
+              <w:pStyle w:val="Compact"/>
+            </w:pPr>
+            <w:r>
+              <w:t xml:space="preserve">Confirmed working</w:t>
+            </w:r>
+          </w:p>
+        </w:tc>
+      </w:tr>
+      <w:tr>
+        <w:tc>
+          <w:tcPr/>
+          <w:p>
+            <w:pPr>
+              <w:pStyle w:val="Compact"/>
+            </w:pPr>
+            <w:r>
+              <w:t xml:space="preserve">SHAKEN/STIR Voice</w:t>
             </w:r>
           </w:p>
         </w:tc>
@@ -1044,85 +1078,61 @@
               <w:pStyle w:val="Compact"/>
             </w:pPr>
             <w:r>
-              <w:t xml:space="preserve">Forms fixed, resubmitted, carrier approved</w:t>
-            </w:r>
-          </w:p>
-        </w:tc>
-      </w:tr>
-      <w:tr>
-        <w:tc>
-          <w:tcPr/>
-          <w:p>
-            <w:pPr>
-              <w:pStyle w:val="Compact"/>
-            </w:pPr>
-            <w:r>
-              <w:t xml:space="preserve">Voice Integrity</w:t>
-            </w:r>
-          </w:p>
-        </w:tc>
-        <w:tc>
-          <w:tcPr/>
-          <w:p>
-            <w:pPr>
-              <w:pStyle w:val="Compact"/>
-            </w:pPr>
-            <w:r>
-              <w:t xml:space="preserve">Passed &amp; Verified</w:t>
-            </w:r>
-          </w:p>
-        </w:tc>
-        <w:tc>
-          <w:tcPr/>
-          <w:p>
-            <w:pPr>
-              <w:pStyle w:val="Compact"/>
-            </w:pPr>
-            <w:r>
               <w:t xml:space="preserve">Confirmed working</w:t>
             </w:r>
           </w:p>
         </w:tc>
       </w:tr>
-      <w:tr>
-        <w:tc>
-          <w:tcPr/>
-          <w:p>
-            <w:pPr>
-              <w:pStyle w:val="Compact"/>
-            </w:pPr>
-            <w:r>
-              <w:t xml:space="preserve">SHAKEN/STIR Voice</w:t>
-            </w:r>
-          </w:p>
-        </w:tc>
-        <w:tc>
-          <w:tcPr/>
-          <w:p>
-            <w:pPr>
-              <w:pStyle w:val="Compact"/>
-            </w:pPr>
-            <w:r>
-              <w:t xml:space="preserve">Approved &amp; Verified</w:t>
-            </w:r>
-          </w:p>
-        </w:tc>
-        <w:tc>
-          <w:tcPr/>
-          <w:p>
-            <w:pPr>
-              <w:pStyle w:val="Compact"/>
-            </w:pPr>
-            <w:r>
-              <w:t xml:space="preserve">Confirmed working</w:t>
-            </w:r>
-          </w:p>
-        </w:tc>
-      </w:tr>
     </w:tbl>
     <w:p>
       <w:pPr>
-        <w:pStyle w:val="BodyText"/>
+        <w:pStyle w:val="BlockText"/>
+      </w:pPr>
+      <w:r>
+        <w:rPr>
+          <w:b/>
+          <w:bCs/>
+        </w:rPr>
+        <w:t xml:space="preserve">CORRECTION (July 28, 2026):</w:t>
+      </w:r>
+      <w:r>
+        <w:t xml:space="preserve"> </w:t>
+      </w:r>
+      <w:r>
+        <w:t xml:space="preserve">there is NO 10DLC / local number on this account and one was never approved. Earlier entries that listed an</w:t>
+      </w:r>
+      <w:r>
+        <w:t xml:space="preserve"> </w:t>
+      </w:r>
+      <w:r>
+        <w:t xml:space="preserve">“A2P 10DLC Registration”</w:t>
+      </w:r>
+      <w:r>
+        <w:t xml:space="preserve"> </w:t>
+      </w:r>
+      <w:r>
+        <w:t xml:space="preserve">as approved were wrong. SMS runs solely on the toll-free</w:t>
+      </w:r>
+      <w:r>
+        <w:t xml:space="preserve"> </w:t>
+      </w:r>
+      <w:r>
+        <w:rPr>
+          <w:b/>
+          <w:bCs/>
+        </w:rPr>
+        <w:t xml:space="preserve">888-316-1695</w:t>
+      </w:r>
+      <w:r>
+        <w:t xml:space="preserve"> </w:t>
+      </w:r>
+      <w:r>
+        <w:t xml:space="preserve">via its Toll-Free Verification (approved July 28, 2026). There is no longer any local number associated with the account.</w:t>
+      </w:r>
+    </w:p>
+    <w:p>
+      <w:pPr>
+        <w:pStyle w:val="FirstParagraph"/>
       </w:pPr>
       <w:r>
         <w:rPr>
@@ -1147,7 +1157,7 @@
         <w:t xml:space="preserve"> </w:t>
       </w:r>
       <w:r>
-        <w:t xml:space="preserve">- All 5 items approved, verified, and confirmed working: Phone Number, Toll-Free SMS, A2P 10DLC, Voice Integrity, SHAKEN/STIR</w:t>
+        <w:t xml:space="preserve">- 4 items approved, verified, and confirmed working: Phone Number (toll-free), Toll-Free SMS, Voice Integrity, SHAKEN/STIR. NO 10DLC/local number exists (corrected July 28).</w:t>
       </w:r>
     </w:p>
     <w:p>
@@ -2814,7 +2824,7 @@
               <w:pStyle w:val="Compact"/>
             </w:pPr>
             <w:r>
-              <w:t xml:space="preserve">A2P Approved</w:t>
+              <w:t xml:space="preserve">Toll-Free A2P approved Jul 28</w:t>
             </w:r>
           </w:p>
         </w:tc>
@@ -2860,7 +2870,7 @@
               <w:pStyle w:val="Compact"/>
             </w:pPr>
             <w:r>
-              <w:t xml:space="preserve">A2P Approved</w:t>
+              <w:t xml:space="preserve">Toll-Free A2P approved Jul 28</w:t>
             </w:r>
           </w:p>
         </w:tc>
@@ -5462,7 +5472,7 @@
         <w:t xml:space="preserve"> </w:t>
       </w:r>
       <w:r>
-        <w:t xml:space="preserve">- All 5 items approved and verified (Phone, Toll-Free, A2P 10DLC, Voice Integrity, SHAKEN/STIR)</w:t>
+        <w:t xml:space="preserve">- Toll-free SMS approved and verified (888-316-1695, July 28), plus Voice Integrity and SHAKEN/STIR. NO 10DLC/local number exists on the account.</w:t>
       </w:r>
     </w:p>
     <w:p>
@@ -6123,7 +6133,19 @@
         <w:t xml:space="preserve"> </w:t>
       </w:r>
       <w:r>
-        <w:t xml:space="preserve">- Toll-free A2P: clarified 10DLC (approved) vs Toll-Free Verification (separate). The 888 TFV was Rejected (30496, use-case/summary inconsistency), corrected to a marketing-consistent description with go.enyrgy.com/sms-opt-in as opt-in proof, resubmitted; now Verification in progress. No SMS from the toll-free until it passes.</w:t>
+        <w:t xml:space="preserve">- Toll-free A2P: the 888 Toll-Free Verification was Rejected (30496, use-case/summary inconsistency), corrected to a marketing-consistent description with go.enyrgy.com/sms-opt-in as opt-in proof, resubmitted, and APPROVED July 28, 2026. SMS now sends from the toll-free. (Correction: an earlier note here referenced a</w:t>
+      </w:r>
+      <w:r>
+        <w:t xml:space="preserve"> </w:t>
+      </w:r>
+      <w:r>
+        <w:t xml:space="preserve">“10DLC (approved)”</w:t>
+      </w:r>
+      <w:r>
+        <w:t xml:space="preserve"> </w:t>
+      </w:r>
+      <w:r>
+        <w:t xml:space="preserve">number; that was wrong. There is no 10DLC/local number on the account.)</w:t>
       </w:r>
       <w:r>
         <w:t xml:space="preserve"> </w:t>

</xml_diff>

<commit_message>
Docs: WF-07 GBP review link confirmed live in Day-14 SMS (TODO + WIP resolved)
Co-Authored-By: Claude Opus 4.8 <noreply@anthropic.com>
</commit_message>
<xml_diff>
--- a/Enyrgy_GHL_WIP-3.docx
+++ b/Enyrgy_GHL_WIP-3.docx
@@ -311,7 +311,7 @@
               <w:pStyle w:val="Compact"/>
             </w:pPr>
             <w:r>
-              <w:t xml:space="preserve">Verified and LIVE (Session 15). Remaining: wire the review link into WF-07.</w:t>
+              <w:t xml:space="preserve">Verified and LIVE (Session 15). Review link wired into WF-07 Day-14 SMS (Google + Trustpilot).</w:t>
             </w:r>
           </w:p>
         </w:tc>
@@ -3027,18 +3027,18 @@
               <w:pStyle w:val="Compact"/>
             </w:pPr>
             <w:r>
-              <w:t xml:space="preserve">Trustpilot URL</w:t>
-            </w:r>
-          </w:p>
-        </w:tc>
-        <w:tc>
-          <w:tcPr/>
-          <w:p>
-            <w:pPr>
-              <w:pStyle w:val="Compact"/>
-            </w:pPr>
-            <w:r>
-              <w:t xml:space="preserve">https://www.trustpilot.com/evaluate/enyrgy.com (temporary)</w:t>
+              <w:t xml:space="preserve">RESOLVED</w:t>
+            </w:r>
+          </w:p>
+        </w:tc>
+        <w:tc>
+          <w:tcPr/>
+          <w:p>
+            <w:pPr>
+              <w:pStyle w:val="Compact"/>
+            </w:pPr>
+            <w:r>
+              <w:t xml:space="preserve">Google review link live in the Day-14 SMS: https://g.page/r/CfN5Rj0CdmrfEAI/review (Trustpilot offered as secondary)</w:t>
             </w:r>
           </w:p>
         </w:tc>

</xml_diff>

<commit_message>
Docs: WF-07 testimonial form link now live in email (WIP placeholder resolved)
Co-Authored-By: Claude Opus 4.8 <noreply@anthropic.com>
</commit_message>
<xml_diff>
--- a/Enyrgy_GHL_WIP-3.docx
+++ b/Enyrgy_GHL_WIP-3.docx
@@ -3097,18 +3097,18 @@
               <w:pStyle w:val="Compact"/>
             </w:pPr>
             <w:r>
-              <w:t xml:space="preserve">Testimonial form</w:t>
-            </w:r>
-          </w:p>
-        </w:tc>
-        <w:tc>
-          <w:tcPr/>
-          <w:p>
-            <w:pPr>
-              <w:pStyle w:val="Compact"/>
-            </w:pPr>
-            <w:r>
-              <w:t xml:space="preserve">https://api.leadconnectorhq.com/widget/form/OjahkWeVDeozQkfG9dW2</w:t>
+              <w:t xml:space="preserve">RESOLVED</w:t>
+            </w:r>
+          </w:p>
+        </w:tc>
+        <w:tc>
+          <w:tcPr/>
+          <w:p>
+            <w:pPr>
+              <w:pStyle w:val="Compact"/>
+            </w:pPr>
+            <w:r>
+              <w:t xml:space="preserve">Testimonial form link now live in the email: https://api.leadconnectorhq.com/widget/form/OjahkWeVDeozQkfG9dW2?notrack=true</w:t>
             </w:r>
           </w:p>
         </w:tc>

</xml_diff>

<commit_message>
Docs: log WF-28 fix (accessory reorders no longer trigger device onboarding)
Co-Authored-By: Claude Opus 4.8 <noreply@anthropic.com>
</commit_message>
<xml_diff>
--- a/Enyrgy_GHL_WIP-3.docx
+++ b/Enyrgy_GHL_WIP-3.docx
@@ -2698,6 +2698,82 @@
             </w:r>
             <w:r>
               <w:t xml:space="preserve">.</w:t>
+            </w:r>
+          </w:p>
+        </w:tc>
+      </w:tr>
+      <w:tr>
+        <w:tc>
+          <w:tcPr/>
+          <w:p>
+            <w:pPr>
+              <w:pStyle w:val="Compact"/>
+            </w:pPr>
+            <w:r>
+              <w:t xml:space="preserve">Accessory reorders triggered device onboarding</w:t>
+            </w:r>
+          </w:p>
+        </w:tc>
+        <w:tc>
+          <w:tcPr/>
+          <w:p>
+            <w:pPr>
+              <w:pStyle w:val="Compact"/>
+            </w:pPr>
+            <w:r>
+              <w:t xml:space="preserve">Medium</w:t>
+            </w:r>
+          </w:p>
+        </w:tc>
+        <w:tc>
+          <w:tcPr/>
+          <w:p>
+            <w:pPr>
+              <w:pStyle w:val="Compact"/>
+            </w:pPr>
+            <w:r>
+              <w:t xml:space="preserve">RESOLVED (Jul 28)</w:t>
+            </w:r>
+          </w:p>
+        </w:tc>
+        <w:tc>
+          <w:tcPr/>
+          <w:p>
+            <w:pPr>
+              <w:pStyle w:val="Compact"/>
+            </w:pPr>
+            <w:r>
+              <w:t xml:space="preserve">WF-28 applied</w:t>
+            </w:r>
+            <w:r>
+              <w:t xml:space="preserve"> </w:t>
+            </w:r>
+            <w:r>
+              <w:rPr>
+                <w:rStyle w:val="VerbatimChar"/>
+              </w:rPr>
+              <w:t xml:space="preserve">unit_shipped</w:t>
+            </w:r>
+            <w:r>
+              <w:t xml:space="preserve"> </w:t>
+            </w:r>
+            <w:r>
+              <w:t xml:space="preserve">on ANY fulfilled Shopify order, so an accessory-only reorder (wall mount) re-fired WF-06 onboarding days after delivery. Fix: gated WF-28’s Order-Fulfilled trigger to Home-System orders only. WF-06 triggers on the</w:t>
+            </w:r>
+            <w:r>
+              <w:t xml:space="preserve"> </w:t>
+            </w:r>
+            <w:r>
+              <w:rPr>
+                <w:rStyle w:val="VerbatimChar"/>
+              </w:rPr>
+              <w:t xml:space="preserve">unit_shipped</w:t>
+            </w:r>
+            <w:r>
+              <w:t xml:space="preserve"> </w:t>
+            </w:r>
+            <w:r>
+              <w:t xml:space="preserve">tag, so the single filter fully controls it.</w:t>
             </w:r>
           </w:p>
         </w:tc>

</xml_diff>

<commit_message>
Docs: referral program deferred to next Enyrgy version (built-in loyalty)
Co-Authored-By: Claude Opus 4.8 <noreply@anthropic.com>
</commit_message>
<xml_diff>
--- a/Enyrgy_GHL_WIP-3.docx
+++ b/Enyrgy_GHL_WIP-3.docx
@@ -335,7 +335,7 @@
               <w:pStyle w:val="Compact"/>
             </w:pPr>
             <w:r>
-              <w:t xml:space="preserve">GO-LIVE IN PROGRESS (Session 15): heartbeats staged and tuned. ON: Sentinel 24h, Quality Control daily, Dispatcher 8h, Sales Outreach 1h, SDR 2h, KB Manager 30d. Remaining to stage: Reactivation, Referral and Reviews (gated on WF-07), Sales Scout, CSM. Execs + Audit/PRD/Onboarding stay event-driven (timer OFF).</w:t>
+              <w:t xml:space="preserve">GO-LIVE IN PROGRESS (Session 15): heartbeats staged and tuned. ON: Sentinel 24h, Quality Control daily, Dispatcher 8h, Sales Outreach 1h, SDR 2h, KB Manager 30d. Remaining to stage: Reactivation, Referral and Reviews (review/testimonial ready; referral function deferred with the built-in loyalty program), Sales Scout, CSM. Execs + Audit/PRD/Onboarding stay event-driven (timer OFF).</w:t>
             </w:r>
           </w:p>
         </w:tc>
@@ -1993,18 +1993,18 @@
               <w:pStyle w:val="Compact"/>
             </w:pPr>
             <w:r>
-              <w:t xml:space="preserve">Scott</w:t>
-            </w:r>
-          </w:p>
-        </w:tc>
-        <w:tc>
-          <w:tcPr/>
-          <w:p>
-            <w:pPr>
-              <w:pStyle w:val="Compact"/>
-            </w:pPr>
-            <w:r>
-              <w:t xml:space="preserve">Install Referral Candy or Smile.io for automated referral links</w:t>
+              <w:t xml:space="preserve">DEFERRED (Jul 28)</w:t>
+            </w:r>
+          </w:p>
+        </w:tc>
+        <w:tc>
+          <w:tcPr/>
+          <w:p>
+            <w:pPr>
+              <w:pStyle w:val="Compact"/>
+            </w:pPr>
+            <w:r>
+              <w:t xml:space="preserve">Not installing a third-party app; referral/loyalty will be built into the next Enyrgy version</w:t>
             </w:r>
           </w:p>
         </w:tc>
@@ -3138,18 +3138,18 @@
               <w:pStyle w:val="Compact"/>
             </w:pPr>
             <w:r>
-              <w:t xml:space="preserve">Referral link</w:t>
-            </w:r>
-          </w:p>
-        </w:tc>
-        <w:tc>
-          <w:tcPr/>
-          <w:p>
-            <w:pPr>
-              <w:pStyle w:val="Compact"/>
-            </w:pPr>
-            <w:r>
-              <w:t xml:space="preserve">Pending Shopify referral app setup</w:t>
+              <w:t xml:space="preserve">DEFERRED (Jul 28)</w:t>
+            </w:r>
+          </w:p>
+        </w:tc>
+        <w:tc>
+          <w:tcPr/>
+          <w:p>
+            <w:pPr>
+              <w:pStyle w:val="Compact"/>
+            </w:pPr>
+            <w:r>
+              <w:t xml:space="preserve">Referral link intentionally held. No third-party referral app; the next Enyrgy version ships a built-in loyalty/referral program that will supply it.</w:t>
             </w:r>
           </w:p>
         </w:tc>

</xml_diff>

<commit_message>
Docs: investor calendar conflict resolved; Q2 update sent to Brian for review
Co-Authored-By: Claude Opus 4.8 <noreply@anthropic.com>
</commit_message>
<xml_diff>
--- a/Enyrgy_GHL_WIP-3.docx
+++ b/Enyrgy_GHL_WIP-3.docx
@@ -1958,18 +1958,18 @@
               <w:pStyle w:val="Compact"/>
             </w:pPr>
             <w:r>
-              <w:t xml:space="preserve">Scott/David/Brian</w:t>
-            </w:r>
-          </w:p>
-        </w:tc>
-        <w:tc>
-          <w:tcPr/>
-          <w:p>
-            <w:pPr>
-              <w:pStyle w:val="Compact"/>
-            </w:pPr>
-            <w:r>
-              <w:t xml:space="preserve">Currently showing all times available - need to verify conflict detection</w:t>
+              <w:t xml:space="preserve">Complete (Jul 28)</w:t>
+            </w:r>
+          </w:p>
+        </w:tc>
+        <w:tc>
+          <w:tcPr/>
+          <w:p>
+            <w:pPr>
+              <w:pStyle w:val="Compact"/>
+            </w:pPr>
+            <w:r>
+              <w:t xml:space="preserve">Conflict detection verified/fixed</w:t>
             </w:r>
           </w:p>
         </w:tc>
@@ -2589,18 +2589,18 @@
               <w:pStyle w:val="Compact"/>
             </w:pPr>
             <w:r>
-              <w:t xml:space="preserve">Under investigation</w:t>
-            </w:r>
-          </w:p>
-        </w:tc>
-        <w:tc>
-          <w:tcPr/>
-          <w:p>
-            <w:pPr>
-              <w:pStyle w:val="Compact"/>
-            </w:pPr>
-            <w:r>
-              <w:t xml:space="preserve">Shows all times available despite 3 calendars connected</w:t>
+              <w:t xml:space="preserve">Resolved (Jul 28)</w:t>
+            </w:r>
+          </w:p>
+        </w:tc>
+        <w:tc>
+          <w:tcPr/>
+          <w:p>
+            <w:pPr>
+              <w:pStyle w:val="Compact"/>
+            </w:pPr>
+            <w:r>
+              <w:t xml:space="preserve">Conflict detection verified working</w:t>
             </w:r>
           </w:p>
         </w:tc>

</xml_diff>

<commit_message>
Docs: testimonial-form link on enyrgy.com website complete
Co-Authored-By: Claude Opus 4.8 <noreply@anthropic.com>
</commit_message>
<xml_diff>
--- a/Enyrgy_GHL_WIP-3.docx
+++ b/Enyrgy_GHL_WIP-3.docx
@@ -2133,18 +2133,18 @@
               <w:pStyle w:val="Compact"/>
             </w:pPr>
             <w:r>
-              <w:t xml:space="preserve">Scott</w:t>
-            </w:r>
-          </w:p>
-        </w:tc>
-        <w:tc>
-          <w:tcPr/>
-          <w:p>
-            <w:pPr>
-              <w:pStyle w:val="Compact"/>
-            </w:pPr>
-            <w:r>
-              <w:t xml:space="preserve">Add link to testimonial form in post-purchase follow up</w:t>
+              <w:t xml:space="preserve">Complete (Jul 28)</w:t>
+            </w:r>
+          </w:p>
+        </w:tc>
+        <w:tc>
+          <w:tcPr/>
+          <w:p>
+            <w:pPr>
+              <w:pStyle w:val="Compact"/>
+            </w:pPr>
+            <w:r>
+              <w:t xml:space="preserve">Link added to the website</w:t>
             </w:r>
           </w:p>
         </w:tc>

</xml_diff>

<commit_message>
Docs: CNAM done (approved); log GHL agency address fix (Ledgerix Pro -> Phoenix)
Co-Authored-By: Claude Opus 4.8 <noreply@anthropic.com>
</commit_message>
<xml_diff>
--- a/Enyrgy_GHL_WIP-3.docx
+++ b/Enyrgy_GHL_WIP-3.docx
@@ -2229,6 +2229,47 @@
               <w:pStyle w:val="Compact"/>
             </w:pPr>
             <w:r>
+              <w:t xml:space="preserve">Complete</w:t>
+            </w:r>
+          </w:p>
+        </w:tc>
+        <w:tc>
+          <w:tcPr/>
+          <w:p>
+            <w:pPr>
+              <w:pStyle w:val="Compact"/>
+            </w:pPr>
+            <w:r>
+              <w:t xml:space="preserve">Approved in LC Phone, Friendly Name</w:t>
+            </w:r>
+            <w:r>
+              <w:t xml:space="preserve"> </w:t>
+            </w:r>
+            <w:r>
+              <w:t xml:space="preserve">“Enyrgy Inc”</w:t>
+            </w:r>
+          </w:p>
+        </w:tc>
+      </w:tr>
+      <w:tr>
+        <w:tc>
+          <w:tcPr/>
+          <w:p>
+            <w:pPr>
+              <w:pStyle w:val="Compact"/>
+            </w:pPr>
+            <w:r>
+              <w:t xml:space="preserve">GHL agency profile address</w:t>
+            </w:r>
+          </w:p>
+        </w:tc>
+        <w:tc>
+          <w:tcPr/>
+          <w:p>
+            <w:pPr>
+              <w:pStyle w:val="Compact"/>
+            </w:pPr>
+            <w:r>
               <w:t xml:space="preserve">Scott</w:t>
             </w:r>
           </w:p>
@@ -2240,19 +2281,7 @@
               <w:pStyle w:val="Compact"/>
             </w:pPr>
             <w:r>
-              <w:t xml:space="preserve">Displays</w:t>
-            </w:r>
-            <w:r>
-              <w:t xml:space="preserve"> </w:t>
-            </w:r>
-            <w:r>
-              <w:t xml:space="preserve">“Enyrgy”</w:t>
-            </w:r>
-            <w:r>
-              <w:t xml:space="preserve"> </w:t>
-            </w:r>
-            <w:r>
-              <w:t xml:space="preserve">on outbound caller ID</w:t>
+              <w:t xml:space="preserve">Agency (Ledgerix Pro LLC) system emails show old Scottsdale address; update in Agency Settings &gt; Business Profile to Phoenix. Distinct from Shopify policy address.</w:t>
             </w:r>
           </w:p>
         </w:tc>

</xml_diff>

<commit_message>
Docs: agency mailing address fixed (Phoenix); leftover Ledgerix Pro sender name is cosmetic
Co-Authored-By: Claude Opus 4.8 <noreply@anthropic.com>
</commit_message>
<xml_diff>
--- a/Enyrgy_GHL_WIP-3.docx
+++ b/Enyrgy_GHL_WIP-3.docx
@@ -2259,29 +2259,73 @@
               <w:pStyle w:val="Compact"/>
             </w:pPr>
             <w:r>
-              <w:t xml:space="preserve">GHL agency profile address</w:t>
-            </w:r>
-          </w:p>
-        </w:tc>
-        <w:tc>
-          <w:tcPr/>
-          <w:p>
-            <w:pPr>
-              <w:pStyle w:val="Compact"/>
-            </w:pPr>
-            <w:r>
-              <w:t xml:space="preserve">Scott</w:t>
-            </w:r>
-          </w:p>
-        </w:tc>
-        <w:tc>
-          <w:tcPr/>
-          <w:p>
-            <w:pPr>
-              <w:pStyle w:val="Compact"/>
-            </w:pPr>
-            <w:r>
-              <w:t xml:space="preserve">Agency (Ledgerix Pro LLC) system emails show old Scottsdale address; update in Agency Settings &gt; Business Profile to Phoenix. Distinct from Shopify policy address.</w:t>
+              <w:t xml:space="preserve">GHL agency mailing address</w:t>
+            </w:r>
+          </w:p>
+        </w:tc>
+        <w:tc>
+          <w:tcPr/>
+          <w:p>
+            <w:pPr>
+              <w:pStyle w:val="Compact"/>
+            </w:pPr>
+            <w:r>
+              <w:t xml:space="preserve">Complete (Jul 28)</w:t>
+            </w:r>
+          </w:p>
+        </w:tc>
+        <w:tc>
+          <w:tcPr/>
+          <w:p>
+            <w:pPr>
+              <w:pStyle w:val="Compact"/>
+            </w:pPr>
+            <w:r>
+              <w:t xml:space="preserve">Corrected to Phoenix at the agency level (was Scottsdale in the CAN-SPAM footer)</w:t>
+            </w:r>
+          </w:p>
+        </w:tc>
+      </w:tr>
+      <w:tr>
+        <w:tc>
+          <w:tcPr/>
+          <w:p>
+            <w:pPr>
+              <w:pStyle w:val="Compact"/>
+            </w:pPr>
+            <w:r>
+              <w:t xml:space="preserve">GHL agency email sender name</w:t>
+            </w:r>
+          </w:p>
+        </w:tc>
+        <w:tc>
+          <w:tcPr/>
+          <w:p>
+            <w:pPr>
+              <w:pStyle w:val="Compact"/>
+            </w:pPr>
+            <w:r>
+              <w:t xml:space="preserve">Scott (optional)</w:t>
+            </w:r>
+          </w:p>
+        </w:tc>
+        <w:tc>
+          <w:tcPr/>
+          <w:p>
+            <w:pPr>
+              <w:pStyle w:val="Compact"/>
+            </w:pPr>
+            <w:r>
+              <w:t xml:space="preserve">Agency emails still send from</w:t>
+            </w:r>
+            <w:r>
+              <w:t xml:space="preserve"> </w:t>
+            </w:r>
+            <w:r>
+              <w:t xml:space="preserve">“Ledgerix Pro LLC”</w:t>
+            </w:r>
+            <w:r>
+              <w:t xml:space="preserve">; update Company/Legal Name or SMTP from-name to Enyrgy Inc. Cosmetic.</w:t>
             </w:r>
           </w:p>
         </w:tc>

</xml_diff>

<commit_message>
Docs: Session 15 end-of-session status (July 28 wrap + agency cross-agency email diagnosis)
Co-Authored-By: Claude Opus 4.8 <noreply@anthropic.com>
</commit_message>
<xml_diff>
--- a/Enyrgy_GHL_WIP-3.docx
+++ b/Enyrgy_GHL_WIP-3.docx
@@ -2294,6 +2294,41 @@
               <w:pStyle w:val="Compact"/>
             </w:pPr>
             <w:r>
+              <w:t xml:space="preserve">GHL agency Business Category</w:t>
+            </w:r>
+          </w:p>
+        </w:tc>
+        <w:tc>
+          <w:tcPr/>
+          <w:p>
+            <w:pPr>
+              <w:pStyle w:val="Compact"/>
+            </w:pPr>
+            <w:r>
+              <w:t xml:space="preserve">Complete (Jul 28)</w:t>
+            </w:r>
+          </w:p>
+        </w:tc>
+        <w:tc>
+          <w:tcPr/>
+          <w:p>
+            <w:pPr>
+              <w:pStyle w:val="Compact"/>
+            </w:pPr>
+            <w:r>
+              <w:t xml:space="preserve">Fixed Medical -&gt; Health &amp; Wellness (Self Service Health Station); matches wellness positioning. No A2P impact (separate TCR filing)</w:t>
+            </w:r>
+          </w:p>
+        </w:tc>
+      </w:tr>
+      <w:tr>
+        <w:tc>
+          <w:tcPr/>
+          <w:p>
+            <w:pPr>
+              <w:pStyle w:val="Compact"/>
+            </w:pPr>
+            <w:r>
               <w:t xml:space="preserve">GHL agency email sender name</w:t>
             </w:r>
           </w:p>
@@ -2305,18 +2340,18 @@
               <w:pStyle w:val="Compact"/>
             </w:pPr>
             <w:r>
-              <w:t xml:space="preserve">Scott (optional)</w:t>
-            </w:r>
-          </w:p>
-        </w:tc>
-        <w:tc>
-          <w:tcPr/>
-          <w:p>
-            <w:pPr>
-              <w:pStyle w:val="Compact"/>
-            </w:pPr>
-            <w:r>
-              <w:t xml:space="preserve">Agency emails still send from</w:t>
+              <w:t xml:space="preserve">HighLevel support (drafted)</w:t>
+            </w:r>
+          </w:p>
+        </w:tc>
+        <w:tc>
+          <w:tcPr/>
+          <w:p>
+            <w:pPr>
+              <w:pStyle w:val="Compact"/>
+            </w:pPr>
+            <w:r>
+              <w:t xml:space="preserve">HIGH, employee-facing. Enyrgy agency (rel 0-167-470) emails send with sender name</w:t>
             </w:r>
             <w:r>
               <w:t xml:space="preserve"> </w:t>
@@ -2325,7 +2360,10 @@
               <w:t xml:space="preserve">“Ledgerix Pro LLC”</w:t>
             </w:r>
             <w:r>
-              <w:t xml:space="preserve">; update Company/Legal Name or SMTP from-name to Enyrgy Inc. Cosmetic.</w:t>
+              <w:t xml:space="preserve"> </w:t>
+            </w:r>
+            <w:r>
+              <w:t xml:space="preserve">(Scott’s separate agency, rel 0-783-665). Both agencies internally correct -&gt; platform cross-agency bug. Support ticket drafted in Master TODO.</w:t>
             </w:r>
           </w:p>
         </w:tc>

</xml_diff>

<commit_message>
FlexOffers: correct the migration status, separate the creative from the program
I recorded publisher migration as complete. It is underway. The old program
cannot be deactivated until every publisher is across, or anyone not yet moved
loses their links, and Brittany owns that completion signal rather than it being
inferable from a publisher count.

The useful distinction the correction surfaces: disabling creative #6673701 and
deactivating program #247334 are separable actions. The creative is what a
publisher just tried to grab and what generates untracked, unpaid traffic;
the program is what has to wait. Recorded as a question for Brittany rather than
a unilateral action, since she owns publisher comms and knows who is still on
the old program.

Co-Authored-By: Claude Opus 5 <noreply@anthropic.com>
</commit_message>
<xml_diff>
--- a/Enyrgy_GHL_WIP-3.docx
+++ b/Enyrgy_GHL_WIP-3.docx
@@ -586,7 +586,7 @@
               <w:pStyle w:val="Compact"/>
             </w:pPr>
             <w:r>
-              <w:t xml:space="preserve">Publisher migration COMPLETE (Aug 4).</w:t>
+              <w:t xml:space="preserve">Publisher migration UNDERWAY, not finished (Aug 4).</w:t>
             </w:r>
             <w:r>
               <w:t xml:space="preserve"> </w:t>
@@ -596,13 +596,23 @@
                 <w:b/>
                 <w:bCs/>
               </w:rPr>
-              <w:t xml:space="preserve">URGENT: disable creative #6673701 and deactivate old program #247334</w:t>
+              <w:t xml:space="preserve">Old program #247334 cannot be deactivated until every publisher is across</w:t>
+            </w:r>
+            <w:r>
+              <w:t xml:space="preserve">, or anyone not yet moved loses their links. Separately, a publisher has already tried to grab old creative</w:t>
             </w:r>
             <w:r>
               <w:t xml:space="preserve"> </w:t>
             </w:r>
             <w:r>
-              <w:t xml:space="preserve">before YourTango begins promoting Wed Aug 5. A publisher already tried to grab the old creative, which has no S2S tracking.</w:t>
+              <w:rPr>
+                <w:b/>
+                <w:bCs/>
+              </w:rPr>
+              <w:t xml:space="preserve">#6673701</w:t>
+            </w:r>
+            <w:r>
+              <w:t xml:space="preserve">, which has no S2S tracking and so pays nothing; ask Brittany whether that creative can be disabled early. YourTango begins promoting Wed Aug 5.</w:t>
             </w:r>
           </w:p>
         </w:tc>

</xml_diff>

<commit_message>
Docs: clear the 19 style-check findings across the repo
First full run of the new check found six em-dashes and thirteen British
spellings. Em-dashes became periods, chosen per sentence rather than
replaced mechanically. Spellings are whole-word replacements.

Checked each in context first: none were API field names, JSON keys or
GHL status labels, so nothing renamed anything the system depends on.

Six of these sat in Master TODO and Session Handoff. The earlier em-dash
sweep scoped itself to campaigns and the KB and treated everything else
as engineering docs, and those two are neither, so they fell in the gap.

Regenerated the five .docx twins that went stale.

Co-Authored-By: Claude Opus 5 <noreply@anthropic.com>
</commit_message>
<xml_diff>
--- a/Enyrgy_GHL_WIP-3.docx
+++ b/Enyrgy_GHL_WIP-3.docx
@@ -77,16 +77,16 @@
     </w:p>
     <w:tbl>
       <w:tblPr>
-        <w:tblBorders>
-          <w:top w:val="single" w:sz="6" w:space="0" w:color="AAAAAA"/>
-          <w:left w:val="single" w:sz="6" w:space="0" w:color="AAAAAA"/>
-          <w:bottom w:val="single" w:sz="6" w:space="0" w:color="AAAAAA"/>
-          <w:right w:val="single" w:sz="6" w:space="0" w:color="AAAAAA"/>
-          <w:insideH w:val="single" w:sz="6" w:space="0" w:color="AAAAAA"/>
-          <w:insideV w:val="single" w:sz="6" w:space="0" w:color="AAAAAA"/>
-        </w:tblBorders>
         <w:tblStyle w:val="Table"/>
         <w:tblW w:type="pct" w:w="5000"/>
+        <w:tblBorders>
+          <w:top w:val="single" w:sz="4" w:space="0" w:color="auto"/>
+          <w:left w:val="single" w:sz="4" w:space="0" w:color="auto"/>
+          <w:bottom w:val="single" w:sz="4" w:space="0" w:color="auto"/>
+          <w:right w:val="single" w:sz="4" w:space="0" w:color="auto"/>
+          <w:insideH w:val="single" w:sz="4" w:space="0" w:color="auto"/>
+          <w:insideV w:val="single" w:sz="4" w:space="0" w:color="auto"/>
+        </w:tblBorders>
         <w:tblLayout w:type="fixed"/>
         <w:tblLook w:firstRow="1" w:lastRow="0" w:firstColumn="0" w:lastColumn="0" w:noHBand="0" w:noVBand="0" w:val="0020"/>
       </w:tblPr>
@@ -1138,14 +1138,6 @@
     </w:p>
     <w:tbl>
       <w:tblPr>
-        <w:tblBorders>
-          <w:top w:val="single" w:sz="6" w:space="0" w:color="AAAAAA"/>
-          <w:left w:val="single" w:sz="6" w:space="0" w:color="AAAAAA"/>
-          <w:bottom w:val="single" w:sz="6" w:space="0" w:color="AAAAAA"/>
-          <w:right w:val="single" w:sz="6" w:space="0" w:color="AAAAAA"/>
-          <w:insideH w:val="single" w:sz="6" w:space="0" w:color="AAAAAA"/>
-          <w:insideV w:val="single" w:sz="6" w:space="0" w:color="AAAAAA"/>
-        </w:tblBorders>
         <w:tblStyle w:val="Table"/>
         <w:tblW w:type="auto" w:w="0"/>
         <w:tblLook w:firstRow="1" w:lastRow="0" w:firstColumn="0" w:lastColumn="0" w:noHBand="0" w:noVBand="0" w:val="0020"/>
@@ -1452,16 +1444,16 @@
     </w:p>
     <w:tbl>
       <w:tblPr>
-        <w:tblBorders>
-          <w:top w:val="single" w:sz="6" w:space="0" w:color="AAAAAA"/>
-          <w:left w:val="single" w:sz="6" w:space="0" w:color="AAAAAA"/>
-          <w:bottom w:val="single" w:sz="6" w:space="0" w:color="AAAAAA"/>
-          <w:right w:val="single" w:sz="6" w:space="0" w:color="AAAAAA"/>
-          <w:insideH w:val="single" w:sz="6" w:space="0" w:color="AAAAAA"/>
-          <w:insideV w:val="single" w:sz="6" w:space="0" w:color="AAAAAA"/>
-        </w:tblBorders>
         <w:tblStyle w:val="Table"/>
         <w:tblW w:type="pct" w:w="5000"/>
+        <w:tblBorders>
+          <w:top w:val="single" w:sz="4" w:space="0" w:color="auto"/>
+          <w:left w:val="single" w:sz="4" w:space="0" w:color="auto"/>
+          <w:bottom w:val="single" w:sz="4" w:space="0" w:color="auto"/>
+          <w:right w:val="single" w:sz="4" w:space="0" w:color="auto"/>
+          <w:insideH w:val="single" w:sz="4" w:space="0" w:color="auto"/>
+          <w:insideV w:val="single" w:sz="4" w:space="0" w:color="auto"/>
+        </w:tblBorders>
         <w:tblLayout w:type="fixed"/>
         <w:tblLook w:firstRow="1" w:lastRow="0" w:firstColumn="0" w:lastColumn="0" w:noHBand="0" w:noVBand="0" w:val="0020"/>
       </w:tblPr>
@@ -2098,16 +2090,16 @@
     </w:p>
     <w:tbl>
       <w:tblPr>
-        <w:tblBorders>
-          <w:top w:val="single" w:sz="6" w:space="0" w:color="AAAAAA"/>
-          <w:left w:val="single" w:sz="6" w:space="0" w:color="AAAAAA"/>
-          <w:bottom w:val="single" w:sz="6" w:space="0" w:color="AAAAAA"/>
-          <w:right w:val="single" w:sz="6" w:space="0" w:color="AAAAAA"/>
-          <w:insideH w:val="single" w:sz="6" w:space="0" w:color="AAAAAA"/>
-          <w:insideV w:val="single" w:sz="6" w:space="0" w:color="AAAAAA"/>
-        </w:tblBorders>
         <w:tblStyle w:val="Table"/>
         <w:tblW w:type="pct" w:w="5000"/>
+        <w:tblBorders>
+          <w:top w:val="single" w:sz="4" w:space="0" w:color="auto"/>
+          <w:left w:val="single" w:sz="4" w:space="0" w:color="auto"/>
+          <w:bottom w:val="single" w:sz="4" w:space="0" w:color="auto"/>
+          <w:right w:val="single" w:sz="4" w:space="0" w:color="auto"/>
+          <w:insideH w:val="single" w:sz="4" w:space="0" w:color="auto"/>
+          <w:insideV w:val="single" w:sz="4" w:space="0" w:color="auto"/>
+        </w:tblBorders>
         <w:tblLayout w:type="fixed"/>
         <w:tblLook w:firstRow="1" w:lastRow="0" w:firstColumn="0" w:lastColumn="0" w:noHBand="0" w:noVBand="0" w:val="0020"/>
       </w:tblPr>
@@ -2412,16 +2404,16 @@
     </w:p>
     <w:tbl>
       <w:tblPr>
-        <w:tblBorders>
-          <w:top w:val="single" w:sz="6" w:space="0" w:color="AAAAAA"/>
-          <w:left w:val="single" w:sz="6" w:space="0" w:color="AAAAAA"/>
-          <w:bottom w:val="single" w:sz="6" w:space="0" w:color="AAAAAA"/>
-          <w:right w:val="single" w:sz="6" w:space="0" w:color="AAAAAA"/>
-          <w:insideH w:val="single" w:sz="6" w:space="0" w:color="AAAAAA"/>
-          <w:insideV w:val="single" w:sz="6" w:space="0" w:color="AAAAAA"/>
-        </w:tblBorders>
         <w:tblStyle w:val="Table"/>
         <w:tblW w:type="pct" w:w="5000"/>
+        <w:tblBorders>
+          <w:top w:val="single" w:sz="4" w:space="0" w:color="auto"/>
+          <w:left w:val="single" w:sz="4" w:space="0" w:color="auto"/>
+          <w:bottom w:val="single" w:sz="4" w:space="0" w:color="auto"/>
+          <w:right w:val="single" w:sz="4" w:space="0" w:color="auto"/>
+          <w:insideH w:val="single" w:sz="4" w:space="0" w:color="auto"/>
+          <w:insideV w:val="single" w:sz="4" w:space="0" w:color="auto"/>
+        </w:tblBorders>
         <w:tblLayout w:type="fixed"/>
         <w:tblLook w:firstRow="1" w:lastRow="0" w:firstColumn="0" w:lastColumn="0" w:noHBand="0" w:noVBand="0" w:val="0020"/>
       </w:tblPr>
@@ -2796,16 +2788,16 @@
     </w:p>
     <w:tbl>
       <w:tblPr>
-        <w:tblBorders>
-          <w:top w:val="single" w:sz="6" w:space="0" w:color="AAAAAA"/>
-          <w:left w:val="single" w:sz="6" w:space="0" w:color="AAAAAA"/>
-          <w:bottom w:val="single" w:sz="6" w:space="0" w:color="AAAAAA"/>
-          <w:right w:val="single" w:sz="6" w:space="0" w:color="AAAAAA"/>
-          <w:insideH w:val="single" w:sz="6" w:space="0" w:color="AAAAAA"/>
-          <w:insideV w:val="single" w:sz="6" w:space="0" w:color="AAAAAA"/>
-        </w:tblBorders>
         <w:tblStyle w:val="Table"/>
         <w:tblW w:type="pct" w:w="5000"/>
+        <w:tblBorders>
+          <w:top w:val="single" w:sz="4" w:space="0" w:color="auto"/>
+          <w:left w:val="single" w:sz="4" w:space="0" w:color="auto"/>
+          <w:bottom w:val="single" w:sz="4" w:space="0" w:color="auto"/>
+          <w:right w:val="single" w:sz="4" w:space="0" w:color="auto"/>
+          <w:insideH w:val="single" w:sz="4" w:space="0" w:color="auto"/>
+          <w:insideV w:val="single" w:sz="4" w:space="0" w:color="auto"/>
+        </w:tblBorders>
         <w:tblLayout w:type="fixed"/>
         <w:tblLook w:firstRow="1" w:lastRow="0" w:firstColumn="0" w:lastColumn="0" w:noHBand="0" w:noVBand="0" w:val="0020"/>
       </w:tblPr>
@@ -3206,16 +3198,16 @@
     </w:p>
     <w:tbl>
       <w:tblPr>
-        <w:tblBorders>
-          <w:top w:val="single" w:sz="6" w:space="0" w:color="AAAAAA"/>
-          <w:left w:val="single" w:sz="6" w:space="0" w:color="AAAAAA"/>
-          <w:bottom w:val="single" w:sz="6" w:space="0" w:color="AAAAAA"/>
-          <w:right w:val="single" w:sz="6" w:space="0" w:color="AAAAAA"/>
-          <w:insideH w:val="single" w:sz="6" w:space="0" w:color="AAAAAA"/>
-          <w:insideV w:val="single" w:sz="6" w:space="0" w:color="AAAAAA"/>
-        </w:tblBorders>
         <w:tblStyle w:val="Table"/>
         <w:tblW w:type="pct" w:w="5000"/>
+        <w:tblBorders>
+          <w:top w:val="single" w:sz="4" w:space="0" w:color="auto"/>
+          <w:left w:val="single" w:sz="4" w:space="0" w:color="auto"/>
+          <w:bottom w:val="single" w:sz="4" w:space="0" w:color="auto"/>
+          <w:right w:val="single" w:sz="4" w:space="0" w:color="auto"/>
+          <w:insideH w:val="single" w:sz="4" w:space="0" w:color="auto"/>
+          <w:insideV w:val="single" w:sz="4" w:space="0" w:color="auto"/>
+        </w:tblBorders>
         <w:tblLayout w:type="fixed"/>
         <w:tblLook w:firstRow="1" w:lastRow="0" w:firstColumn="0" w:lastColumn="0" w:noHBand="0" w:noVBand="0" w:val="0020"/>
       </w:tblPr>
@@ -4424,16 +4416,16 @@
     </w:p>
     <w:tbl>
       <w:tblPr>
-        <w:tblBorders>
-          <w:top w:val="single" w:sz="6" w:space="0" w:color="AAAAAA"/>
-          <w:left w:val="single" w:sz="6" w:space="0" w:color="AAAAAA"/>
-          <w:bottom w:val="single" w:sz="6" w:space="0" w:color="AAAAAA"/>
-          <w:right w:val="single" w:sz="6" w:space="0" w:color="AAAAAA"/>
-          <w:insideH w:val="single" w:sz="6" w:space="0" w:color="AAAAAA"/>
-          <w:insideV w:val="single" w:sz="6" w:space="0" w:color="AAAAAA"/>
-        </w:tblBorders>
         <w:tblStyle w:val="Table"/>
         <w:tblW w:type="pct" w:w="5000"/>
+        <w:tblBorders>
+          <w:top w:val="single" w:sz="4" w:space="0" w:color="auto"/>
+          <w:left w:val="single" w:sz="4" w:space="0" w:color="auto"/>
+          <w:bottom w:val="single" w:sz="4" w:space="0" w:color="auto"/>
+          <w:right w:val="single" w:sz="4" w:space="0" w:color="auto"/>
+          <w:insideH w:val="single" w:sz="4" w:space="0" w:color="auto"/>
+          <w:insideV w:val="single" w:sz="4" w:space="0" w:color="auto"/>
+        </w:tblBorders>
         <w:tblLayout w:type="fixed"/>
         <w:tblLook w:firstRow="1" w:lastRow="0" w:firstColumn="0" w:lastColumn="0" w:noHBand="0" w:noVBand="0" w:val="0020"/>
       </w:tblPr>
@@ -4848,16 +4840,16 @@
     </w:p>
     <w:tbl>
       <w:tblPr>
-        <w:tblBorders>
-          <w:top w:val="single" w:sz="6" w:space="0" w:color="AAAAAA"/>
-          <w:left w:val="single" w:sz="6" w:space="0" w:color="AAAAAA"/>
-          <w:bottom w:val="single" w:sz="6" w:space="0" w:color="AAAAAA"/>
-          <w:right w:val="single" w:sz="6" w:space="0" w:color="AAAAAA"/>
-          <w:insideH w:val="single" w:sz="6" w:space="0" w:color="AAAAAA"/>
-          <w:insideV w:val="single" w:sz="6" w:space="0" w:color="AAAAAA"/>
-        </w:tblBorders>
         <w:tblStyle w:val="Table"/>
         <w:tblW w:type="pct" w:w="5000"/>
+        <w:tblBorders>
+          <w:top w:val="single" w:sz="4" w:space="0" w:color="auto"/>
+          <w:left w:val="single" w:sz="4" w:space="0" w:color="auto"/>
+          <w:bottom w:val="single" w:sz="4" w:space="0" w:color="auto"/>
+          <w:right w:val="single" w:sz="4" w:space="0" w:color="auto"/>
+          <w:insideH w:val="single" w:sz="4" w:space="0" w:color="auto"/>
+          <w:insideV w:val="single" w:sz="4" w:space="0" w:color="auto"/>
+        </w:tblBorders>
         <w:tblLayout w:type="fixed"/>
         <w:tblLook w:firstRow="1" w:lastRow="0" w:firstColumn="0" w:lastColumn="0" w:noHBand="0" w:noVBand="0" w:val="0020"/>
       </w:tblPr>
@@ -5667,16 +5659,16 @@
     </w:p>
     <w:tbl>
       <w:tblPr>
-        <w:tblBorders>
-          <w:top w:val="single" w:sz="6" w:space="0" w:color="AAAAAA"/>
-          <w:left w:val="single" w:sz="6" w:space="0" w:color="AAAAAA"/>
-          <w:bottom w:val="single" w:sz="6" w:space="0" w:color="AAAAAA"/>
-          <w:right w:val="single" w:sz="6" w:space="0" w:color="AAAAAA"/>
-          <w:insideH w:val="single" w:sz="6" w:space="0" w:color="AAAAAA"/>
-          <w:insideV w:val="single" w:sz="6" w:space="0" w:color="AAAAAA"/>
-        </w:tblBorders>
         <w:tblStyle w:val="Table"/>
         <w:tblW w:type="pct" w:w="5000"/>
+        <w:tblBorders>
+          <w:top w:val="single" w:sz="4" w:space="0" w:color="auto"/>
+          <w:left w:val="single" w:sz="4" w:space="0" w:color="auto"/>
+          <w:bottom w:val="single" w:sz="4" w:space="0" w:color="auto"/>
+          <w:right w:val="single" w:sz="4" w:space="0" w:color="auto"/>
+          <w:insideH w:val="single" w:sz="4" w:space="0" w:color="auto"/>
+          <w:insideV w:val="single" w:sz="4" w:space="0" w:color="auto"/>
+        </w:tblBorders>
         <w:tblLayout w:type="fixed"/>
         <w:tblLook w:firstRow="1" w:lastRow="0" w:firstColumn="0" w:lastColumn="0" w:noHBand="0" w:noVBand="0" w:val="0020"/>
       </w:tblPr>
@@ -5940,16 +5932,16 @@
     </w:p>
     <w:tbl>
       <w:tblPr>
-        <w:tblBorders>
-          <w:top w:val="single" w:sz="6" w:space="0" w:color="AAAAAA"/>
-          <w:left w:val="single" w:sz="6" w:space="0" w:color="AAAAAA"/>
-          <w:bottom w:val="single" w:sz="6" w:space="0" w:color="AAAAAA"/>
-          <w:right w:val="single" w:sz="6" w:space="0" w:color="AAAAAA"/>
-          <w:insideH w:val="single" w:sz="6" w:space="0" w:color="AAAAAA"/>
-          <w:insideV w:val="single" w:sz="6" w:space="0" w:color="AAAAAA"/>
-        </w:tblBorders>
         <w:tblStyle w:val="Table"/>
         <w:tblW w:type="pct" w:w="5000"/>
+        <w:tblBorders>
+          <w:top w:val="single" w:sz="4" w:space="0" w:color="auto"/>
+          <w:left w:val="single" w:sz="4" w:space="0" w:color="auto"/>
+          <w:bottom w:val="single" w:sz="4" w:space="0" w:color="auto"/>
+          <w:right w:val="single" w:sz="4" w:space="0" w:color="auto"/>
+          <w:insideH w:val="single" w:sz="4" w:space="0" w:color="auto"/>
+          <w:insideV w:val="single" w:sz="4" w:space="0" w:color="auto"/>
+        </w:tblBorders>
         <w:tblLayout w:type="fixed"/>
         <w:tblLook w:firstRow="1" w:lastRow="0" w:firstColumn="0" w:lastColumn="0" w:noHBand="0" w:noVBand="0" w:val="0020"/>
       </w:tblPr>
@@ -6409,16 +6401,16 @@
     </w:p>
     <w:tbl>
       <w:tblPr>
-        <w:tblBorders>
-          <w:top w:val="single" w:sz="6" w:space="0" w:color="AAAAAA"/>
-          <w:left w:val="single" w:sz="6" w:space="0" w:color="AAAAAA"/>
-          <w:bottom w:val="single" w:sz="6" w:space="0" w:color="AAAAAA"/>
-          <w:right w:val="single" w:sz="6" w:space="0" w:color="AAAAAA"/>
-          <w:insideH w:val="single" w:sz="6" w:space="0" w:color="AAAAAA"/>
-          <w:insideV w:val="single" w:sz="6" w:space="0" w:color="AAAAAA"/>
-        </w:tblBorders>
         <w:tblStyle w:val="Table"/>
         <w:tblW w:type="pct" w:w="5000"/>
+        <w:tblBorders>
+          <w:top w:val="single" w:sz="4" w:space="0" w:color="auto"/>
+          <w:left w:val="single" w:sz="4" w:space="0" w:color="auto"/>
+          <w:bottom w:val="single" w:sz="4" w:space="0" w:color="auto"/>
+          <w:right w:val="single" w:sz="4" w:space="0" w:color="auto"/>
+          <w:insideH w:val="single" w:sz="4" w:space="0" w:color="auto"/>
+          <w:insideV w:val="single" w:sz="4" w:space="0" w:color="auto"/>
+        </w:tblBorders>
         <w:tblLayout w:type="fixed"/>
         <w:tblLook w:firstRow="1" w:lastRow="0" w:firstColumn="0" w:lastColumn="0" w:noHBand="0" w:noVBand="0" w:val="0020"/>
       </w:tblPr>
@@ -6748,14 +6740,6 @@
     </w:p>
     <w:tbl>
       <w:tblPr>
-        <w:tblBorders>
-          <w:top w:val="single" w:sz="6" w:space="0" w:color="AAAAAA"/>
-          <w:left w:val="single" w:sz="6" w:space="0" w:color="AAAAAA"/>
-          <w:bottom w:val="single" w:sz="6" w:space="0" w:color="AAAAAA"/>
-          <w:right w:val="single" w:sz="6" w:space="0" w:color="AAAAAA"/>
-          <w:insideH w:val="single" w:sz="6" w:space="0" w:color="AAAAAA"/>
-          <w:insideV w:val="single" w:sz="6" w:space="0" w:color="AAAAAA"/>
-        </w:tblBorders>
         <w:tblStyle w:val="Table"/>
         <w:tblW w:type="auto" w:w="0"/>
         <w:tblLook w:firstRow="1" w:lastRow="0" w:firstColumn="0" w:lastColumn="0" w:noHBand="0" w:noVBand="0" w:val="0020"/>
@@ -7562,7 +7546,7 @@
         <w:t xml:space="preserve"> </w:t>
       </w:r>
       <w:r>
-        <w:t xml:space="preserve">created via the setup wizard (mission set; Claude Code adapter; env check passed). Cancelled Paperclip’s auto-fired demo task subtree (</w:t>
+        <w:t xml:space="preserve">created via the setup wizard (mission set; Claude Code adapter; env check passed). Canceled Paperclip’s auto-fired demo task subtree (</w:t>
       </w:r>
       <w:r>
         <w:t xml:space="preserve">“Hire your first engineer”</w:t>

</xml_diff>